<commit_message>
Embed twelve images in the docx, not eight
A reviewer reported only four images visible in the Google Doc, which means the docx
was never imported — it carried eight. Four more are added so a single import lands as
much of the visual argument as the document can carry:

  scene-02-problem     the deadlock, in section 1
  scene-03-mechanism   markers leaving the contract, in section 4
  scene-06-tamper      a tampered receipt refused, in section 12
  scene-07-findings    the five testnet findings, in section 17

All six site screenshots were already in and stay in. The seventh PNG in
screenshots/ is a capture of the dossier's own first page, so embedding it inside the
dossier would be circular — the twelve here are the ones that carry an argument.

INDEX.txt now says File > Import document > Replace rather than dragging into Drive,
because Import keeps the Doc's existing URL and so needs no change to the submitted
form. It also lists the walkthrough page.
</commit_message>
<xml_diff>
--- a/submission/Nullstamp-Submission.docx
+++ b/submission/Nullstamp-Submission.docx
@@ -770,6 +770,59 @@
     </w:p>
     <w:p>
       <w:pPr>
+        <w:jc w:val="center"/>
+      </w:pPr>
+      <w:r>
+        <w:drawing>
+          <wp:inline xmlns:a="http://schemas.openxmlformats.org/drawingml/2006/main" xmlns:pic="http://schemas.openxmlformats.org/drawingml/2006/picture">
+            <wp:extent cx="6035040" cy="3394710"/>
+            <wp:docPr id="1" name="Picture 1"/>
+            <wp:cNvGraphicFramePr>
+              <a:graphicFrameLocks noChangeAspect="1"/>
+            </wp:cNvGraphicFramePr>
+            <a:graphic>
+              <a:graphicData uri="http://schemas.openxmlformats.org/drawingml/2006/picture">
+                <pic:pic>
+                  <pic:nvPicPr>
+                    <pic:cNvPr id="0" name="scene-02-problem.png"/>
+                    <pic:cNvPicPr/>
+                  </pic:nvPicPr>
+                  <pic:blipFill>
+                    <a:blip r:embed="rId9"/>
+                    <a:stretch>
+                      <a:fillRect/>
+                    </a:stretch>
+                  </pic:blipFill>
+                  <pic:spPr>
+                    <a:xfrm>
+                      <a:off x="0" y="0"/>
+                      <a:ext cx="6035040" cy="3394710"/>
+                    </a:xfrm>
+                    <a:prstGeom prst="rect"/>
+                  </pic:spPr>
+                </pic:pic>
+              </a:graphicData>
+            </a:graphic>
+          </wp:inline>
+        </w:drawing>
+      </w:r>
+    </w:p>
+    <w:p>
+      <w:pPr>
+        <w:spacing w:before="60" w:after="240"/>
+      </w:pPr>
+      <w:r>
+        <w:rPr>
+          <w:rFonts w:ascii="Segoe UI" w:hAnsi="Segoe UI"/>
+          <w:i/>
+          <w:color w:val="4A5560"/>
+          <w:sz w:val="17"/>
+        </w:rPr>
+        <w:t>The deadlock the design exists to break: a complete log is a pile of personal data, and a redacted one cannot prove itself.</w:t>
+      </w:r>
+    </w:p>
+    <w:p>
+      <w:pPr>
         <w:keepNext/>
         <w:spacing w:before="360" w:after="120"/>
         <w:pBdr>
@@ -1527,6 +1580,59 @@
     </w:p>
     <w:p>
       <w:pPr>
+        <w:jc w:val="center"/>
+      </w:pPr>
+      <w:r>
+        <w:drawing>
+          <wp:inline xmlns:a="http://schemas.openxmlformats.org/drawingml/2006/main" xmlns:pic="http://schemas.openxmlformats.org/drawingml/2006/picture">
+            <wp:extent cx="6035040" cy="3394710"/>
+            <wp:docPr id="2" name="Picture 2"/>
+            <wp:cNvGraphicFramePr>
+              <a:graphicFrameLocks noChangeAspect="1"/>
+            </wp:cNvGraphicFramePr>
+            <a:graphic>
+              <a:graphicData uri="http://schemas.openxmlformats.org/drawingml/2006/picture">
+                <pic:pic>
+                  <pic:nvPicPr>
+                    <pic:cNvPr id="0" name="scene-03-mechanism.png"/>
+                    <pic:cNvPicPr/>
+                  </pic:nvPicPr>
+                  <pic:blipFill>
+                    <a:blip r:embed="rId10"/>
+                    <a:stretch>
+                      <a:fillRect/>
+                    </a:stretch>
+                  </pic:blipFill>
+                  <pic:spPr>
+                    <a:xfrm>
+                      <a:off x="0" y="0"/>
+                      <a:ext cx="6035040" cy="3394710"/>
+                    </a:xfrm>
+                    <a:prstGeom prst="rect"/>
+                  </pic:spPr>
+                </pic:pic>
+              </a:graphicData>
+            </a:graphic>
+          </wp:inline>
+        </w:drawing>
+      </w:r>
+    </w:p>
+    <w:p>
+      <w:pPr>
+        <w:spacing w:before="60" w:after="240"/>
+      </w:pPr>
+      <w:r>
+        <w:rPr>
+          <w:rFonts w:ascii="Segoe UI" w:hAnsi="Segoe UI"/>
+          <w:i/>
+          <w:color w:val="4A5560"/>
+          <w:sz w:val="17"/>
+        </w:rPr>
+        <w:t>Markers leave the contract; the host fills in the values after the request is already assembled. The contract is not promising not to store them — it never holds them.</w:t>
+      </w:r>
+    </w:p>
+    <w:p>
+      <w:pPr>
         <w:keepNext/>
         <w:spacing w:before="360" w:after="120"/>
         <w:pBdr>
@@ -2778,7 +2884,7 @@
         <w:drawing>
           <wp:inline xmlns:a="http://schemas.openxmlformats.org/drawingml/2006/main" xmlns:pic="http://schemas.openxmlformats.org/drawingml/2006/picture">
             <wp:extent cx="6035040" cy="3394710"/>
-            <wp:docPr id="1" name="Picture 1"/>
+            <wp:docPr id="3" name="Picture 3"/>
             <wp:cNvGraphicFramePr>
               <a:graphicFrameLocks noChangeAspect="1"/>
             </wp:cNvGraphicFramePr>
@@ -2790,7 +2896,7 @@
                     <pic:cNvPicPr/>
                   </pic:nvPicPr>
                   <pic:blipFill>
-                    <a:blip r:embed="rId9"/>
+                    <a:blip r:embed="rId11"/>
                     <a:stretch>
                       <a:fillRect/>
                     </a:stretch>
@@ -3381,7 +3487,7 @@
         <w:drawing>
           <wp:inline xmlns:a="http://schemas.openxmlformats.org/drawingml/2006/main" xmlns:pic="http://schemas.openxmlformats.org/drawingml/2006/picture">
             <wp:extent cx="6035040" cy="3394710"/>
-            <wp:docPr id="2" name="Picture 2"/>
+            <wp:docPr id="4" name="Picture 4"/>
             <wp:cNvGraphicFramePr>
               <a:graphicFrameLocks noChangeAspect="1"/>
             </wp:cNvGraphicFramePr>
@@ -3393,7 +3499,7 @@
                     <pic:cNvPicPr/>
                   </pic:nvPicPr>
                   <pic:blipFill>
-                    <a:blip r:embed="rId10"/>
+                    <a:blip r:embed="rId12"/>
                     <a:stretch>
                       <a:fillRect/>
                     </a:stretch>
@@ -3554,6 +3660,59 @@
       </w:r>
     </w:p>
     <w:p>
+      <w:pPr>
+        <w:jc w:val="center"/>
+      </w:pPr>
+      <w:r>
+        <w:drawing>
+          <wp:inline xmlns:a="http://schemas.openxmlformats.org/drawingml/2006/main" xmlns:pic="http://schemas.openxmlformats.org/drawingml/2006/picture">
+            <wp:extent cx="6035040" cy="3394710"/>
+            <wp:docPr id="5" name="Picture 5"/>
+            <wp:cNvGraphicFramePr>
+              <a:graphicFrameLocks noChangeAspect="1"/>
+            </wp:cNvGraphicFramePr>
+            <a:graphic>
+              <a:graphicData uri="http://schemas.openxmlformats.org/drawingml/2006/picture">
+                <pic:pic>
+                  <pic:nvPicPr>
+                    <pic:cNvPr id="0" name="scene-06-tamper.png"/>
+                    <pic:cNvPicPr/>
+                  </pic:nvPicPr>
+                  <pic:blipFill>
+                    <a:blip r:embed="rId13"/>
+                    <a:stretch>
+                      <a:fillRect/>
+                    </a:stretch>
+                  </pic:blipFill>
+                  <pic:spPr>
+                    <a:xfrm>
+                      <a:off x="0" y="0"/>
+                      <a:ext cx="6035040" cy="3394710"/>
+                    </a:xfrm>
+                    <a:prstGeom prst="rect"/>
+                  </pic:spPr>
+                </pic:pic>
+              </a:graphicData>
+            </a:graphic>
+          </wp:inline>
+        </w:drawing>
+      </w:r>
+    </w:p>
+    <w:p>
+      <w:pPr>
+        <w:spacing w:before="60" w:after="240"/>
+      </w:pPr>
+      <w:r>
+        <w:rPr>
+          <w:rFonts w:ascii="Segoe UI" w:hAnsi="Segoe UI"/>
+          <w:i/>
+          <w:color w:val="4A5560"/>
+          <w:sz w:val="17"/>
+        </w:rPr>
+        <w:t>Claiming less than you touched: the digest no longer agrees, and the identity derived from it fails with it.</w:t>
+      </w:r>
+    </w:p>
+    <w:p>
       <w:r>
         <w:br w:type="page"/>
       </w:r>
@@ -3598,7 +3757,7 @@
         <w:drawing>
           <wp:inline xmlns:a="http://schemas.openxmlformats.org/drawingml/2006/main" xmlns:pic="http://schemas.openxmlformats.org/drawingml/2006/picture">
             <wp:extent cx="6035040" cy="11315700"/>
-            <wp:docPr id="3" name="Picture 3"/>
+            <wp:docPr id="6" name="Picture 6"/>
             <wp:cNvGraphicFramePr>
               <a:graphicFrameLocks noChangeAspect="1"/>
             </wp:cNvGraphicFramePr>
@@ -3610,7 +3769,7 @@
                     <pic:cNvPicPr/>
                   </pic:nvPicPr>
                   <pic:blipFill>
-                    <a:blip r:embed="rId11"/>
+                    <a:blip r:embed="rId14"/>
                     <a:stretch>
                       <a:fillRect/>
                     </a:stretch>
@@ -3669,7 +3828,7 @@
         <w:drawing>
           <wp:inline xmlns:a="http://schemas.openxmlformats.org/drawingml/2006/main" xmlns:pic="http://schemas.openxmlformats.org/drawingml/2006/picture">
             <wp:extent cx="6035040" cy="4819650"/>
-            <wp:docPr id="4" name="Picture 4"/>
+            <wp:docPr id="7" name="Picture 7"/>
             <wp:cNvGraphicFramePr>
               <a:graphicFrameLocks noChangeAspect="1"/>
             </wp:cNvGraphicFramePr>
@@ -3681,7 +3840,7 @@
                     <pic:cNvPicPr/>
                   </pic:nvPicPr>
                   <pic:blipFill>
-                    <a:blip r:embed="rId12"/>
+                    <a:blip r:embed="rId15"/>
                     <a:stretch>
                       <a:fillRect/>
                     </a:stretch>
@@ -3754,7 +3913,7 @@
         <w:drawing>
           <wp:inline xmlns:a="http://schemas.openxmlformats.org/drawingml/2006/main" xmlns:pic="http://schemas.openxmlformats.org/drawingml/2006/picture">
             <wp:extent cx="6035040" cy="4819650"/>
-            <wp:docPr id="5" name="Picture 5"/>
+            <wp:docPr id="8" name="Picture 8"/>
             <wp:cNvGraphicFramePr>
               <a:graphicFrameLocks noChangeAspect="1"/>
             </wp:cNvGraphicFramePr>
@@ -3766,7 +3925,7 @@
                     <pic:cNvPicPr/>
                   </pic:nvPicPr>
                   <pic:blipFill>
-                    <a:blip r:embed="rId13"/>
+                    <a:blip r:embed="rId16"/>
                     <a:stretch>
                       <a:fillRect/>
                     </a:stretch>
@@ -3807,7 +3966,7 @@
         <w:drawing>
           <wp:inline xmlns:a="http://schemas.openxmlformats.org/drawingml/2006/main" xmlns:pic="http://schemas.openxmlformats.org/drawingml/2006/picture">
             <wp:extent cx="6035040" cy="4819650"/>
-            <wp:docPr id="6" name="Picture 6"/>
+            <wp:docPr id="9" name="Picture 9"/>
             <wp:cNvGraphicFramePr>
               <a:graphicFrameLocks noChangeAspect="1"/>
             </wp:cNvGraphicFramePr>
@@ -3819,7 +3978,7 @@
                     <pic:cNvPicPr/>
                   </pic:nvPicPr>
                   <pic:blipFill>
-                    <a:blip r:embed="rId14"/>
+                    <a:blip r:embed="rId17"/>
                     <a:stretch>
                       <a:fillRect/>
                     </a:stretch>
@@ -3860,7 +4019,7 @@
         <w:drawing>
           <wp:inline xmlns:a="http://schemas.openxmlformats.org/drawingml/2006/main" xmlns:pic="http://schemas.openxmlformats.org/drawingml/2006/picture">
             <wp:extent cx="6035040" cy="5238750"/>
-            <wp:docPr id="7" name="Picture 7"/>
+            <wp:docPr id="10" name="Picture 10"/>
             <wp:cNvGraphicFramePr>
               <a:graphicFrameLocks noChangeAspect="1"/>
             </wp:cNvGraphicFramePr>
@@ -3872,7 +4031,7 @@
                     <pic:cNvPicPr/>
                   </pic:nvPicPr>
                   <pic:blipFill>
-                    <a:blip r:embed="rId15"/>
+                    <a:blip r:embed="rId18"/>
                     <a:stretch>
                       <a:fillRect/>
                     </a:stretch>
@@ -3931,7 +4090,7 @@
         <w:drawing>
           <wp:inline xmlns:a="http://schemas.openxmlformats.org/drawingml/2006/main" xmlns:pic="http://schemas.openxmlformats.org/drawingml/2006/picture">
             <wp:extent cx="6035040" cy="22159912"/>
-            <wp:docPr id="8" name="Picture 8"/>
+            <wp:docPr id="11" name="Picture 11"/>
             <wp:cNvGraphicFramePr>
               <a:graphicFrameLocks noChangeAspect="1"/>
             </wp:cNvGraphicFramePr>
@@ -3943,7 +4102,7 @@
                     <pic:cNvPicPr/>
                   </pic:nvPicPr>
                   <pic:blipFill>
-                    <a:blip r:embed="rId16"/>
+                    <a:blip r:embed="rId19"/>
                     <a:stretch>
                       <a:fillRect/>
                     </a:stretch>
@@ -5326,6 +5485,59 @@
     </w:p>
     <w:p>
       <w:pPr>
+        <w:jc w:val="center"/>
+      </w:pPr>
+      <w:r>
+        <w:drawing>
+          <wp:inline xmlns:a="http://schemas.openxmlformats.org/drawingml/2006/main" xmlns:pic="http://schemas.openxmlformats.org/drawingml/2006/picture">
+            <wp:extent cx="6035040" cy="3394710"/>
+            <wp:docPr id="12" name="Picture 12"/>
+            <wp:cNvGraphicFramePr>
+              <a:graphicFrameLocks noChangeAspect="1"/>
+            </wp:cNvGraphicFramePr>
+            <a:graphic>
+              <a:graphicData uri="http://schemas.openxmlformats.org/drawingml/2006/picture">
+                <pic:pic>
+                  <pic:nvPicPr>
+                    <pic:cNvPr id="0" name="scene-07-findings.png"/>
+                    <pic:cNvPicPr/>
+                  </pic:nvPicPr>
+                  <pic:blipFill>
+                    <a:blip r:embed="rId20"/>
+                    <a:stretch>
+                      <a:fillRect/>
+                    </a:stretch>
+                  </pic:blipFill>
+                  <pic:spPr>
+                    <a:xfrm>
+                      <a:off x="0" y="0"/>
+                      <a:ext cx="6035040" cy="3394710"/>
+                    </a:xfrm>
+                    <a:prstGeom prst="rect"/>
+                  </pic:spPr>
+                </pic:pic>
+              </a:graphicData>
+            </a:graphic>
+          </wp:inline>
+        </w:drawing>
+      </w:r>
+    </w:p>
+    <w:p>
+      <w:pPr>
+        <w:spacing w:before="60" w:after="240"/>
+      </w:pPr>
+      <w:r>
+        <w:rPr>
+          <w:rFonts w:ascii="Segoe UI" w:hAnsi="Segoe UI"/>
+          <w:i/>
+          <w:color w:val="4A5560"/>
+          <w:sz w:val="17"/>
+        </w:rPr>
+        <w:t>The five findings that only surfaced by running a contract against the live network. None are discoverable from the documentation.</w:t>
+      </w:r>
+    </w:p>
+    <w:p>
+      <w:pPr>
         <w:keepNext/>
         <w:spacing w:before="360" w:after="120"/>
         <w:pBdr>

</xml_diff>